<commit_message>
Feature: Add robust agenda generation and fix row
</commit_message>
<xml_diff>
--- a/templates/board_minutes_template.docx
+++ b/templates/board_minutes_template.docx
@@ -46,19 +46,39 @@
                 <w:szCs w:val="48"/>
               </w:rPr>
             </w:pPr>
-            <w:proofErr w:type="spellStart"/>
-            <w:r>
-              <w:rPr>
-                <w:rFonts w:eastAsia="標楷體" w:hAnsi="標楷體"/>
+            <w:r>
+              <w:rPr>
+                <w:rFonts w:eastAsia="標楷體" w:hAnsi="標楷體" w:hint="eastAsia"/>
                 <w:b/>
                 <w:bCs/>
                 <w:color w:val="000000"/>
                 <w:sz w:val="36"/>
                 <w:szCs w:val="48"/>
               </w:rPr>
+              <w:t>{{</w:t>
+            </w:r>
+            <w:r>
+              <w:rPr>
+                <w:rFonts w:eastAsia="標楷體" w:hAnsi="標楷體"/>
+                <w:b/>
+                <w:bCs/>
+                <w:color w:val="000000"/>
+                <w:sz w:val="36"/>
+                <w:szCs w:val="48"/>
+              </w:rPr>
               <w:t>companyName</w:t>
             </w:r>
-            <w:proofErr w:type="spellEnd"/>
+            <w:r>
+              <w:rPr>
+                <w:rFonts w:eastAsia="標楷體" w:hAnsi="標楷體" w:hint="eastAsia"/>
+                <w:b/>
+                <w:bCs/>
+                <w:color w:val="000000"/>
+                <w:sz w:val="36"/>
+                <w:szCs w:val="48"/>
+              </w:rPr>
+              <w:t>}}</w:t>
+            </w:r>
             <w:r>
               <w:rPr>
                 <w:rFonts w:eastAsia="標楷體" w:hAnsi="標楷體" w:hint="eastAsia"/>
@@ -1252,12 +1272,30 @@
             </w:r>
             <w:r>
               <w:rPr>
+                <w:rFonts w:eastAsia="標楷體" w:hAnsi="標楷體" w:hint="eastAsia"/>
+                <w:color w:val="000000"/>
+                <w:sz w:val="28"/>
+                <w:szCs w:val="28"/>
+              </w:rPr>
+              <w:t>{{</w:t>
+            </w:r>
+            <w:r>
+              <w:rPr>
                 <w:rFonts w:eastAsia="標楷體" w:hAnsi="標楷體"/>
                 <w:color w:val="000000"/>
                 <w:sz w:val="28"/>
                 <w:szCs w:val="28"/>
               </w:rPr>
               <w:t>chairperson</w:t>
+            </w:r>
+            <w:r>
+              <w:rPr>
+                <w:rFonts w:eastAsia="標楷體" w:hAnsi="標楷體" w:hint="eastAsia"/>
+                <w:color w:val="000000"/>
+                <w:sz w:val="28"/>
+                <w:szCs w:val="28"/>
+              </w:rPr>
+              <w:t>}}</w:t>
             </w:r>
             <w:r>
               <w:rPr>
@@ -1796,14 +1834,395 @@
           <w:szCs w:val="28"/>
         </w:rPr>
       </w:pPr>
-      <w:r>
+    </w:p>
+    <w:p>
+      <w:pPr>
+        <w:snapToGrid w:val="0"/>
+        <w:spacing w:line="240" w:lineRule="atLeast"/>
         <w:rPr>
           <w:rFonts w:eastAsia="標楷體"/>
           <w:sz w:val="28"/>
           <w:szCs w:val="28"/>
         </w:rPr>
-        <w:t xml:space="preserve"> </w:t>
-      </w:r>
+      </w:pPr>
+    </w:p>
+    <w:p>
+      <w:pPr>
+        <w:snapToGrid w:val="0"/>
+        <w:spacing w:line="240" w:lineRule="atLeast"/>
+        <w:rPr>
+          <w:rFonts w:eastAsia="標楷體"/>
+          <w:sz w:val="28"/>
+          <w:szCs w:val="28"/>
+        </w:rPr>
+      </w:pPr>
+    </w:p>
+    <w:p>
+      <w:pPr>
+        <w:snapToGrid w:val="0"/>
+        <w:spacing w:line="240" w:lineRule="atLeast"/>
+        <w:rPr>
+          <w:rFonts w:eastAsia="標楷體"/>
+          <w:sz w:val="28"/>
+          <w:szCs w:val="28"/>
+        </w:rPr>
+      </w:pPr>
+    </w:p>
+    <w:p>
+      <w:pPr>
+        <w:snapToGrid w:val="0"/>
+        <w:spacing w:line="240" w:lineRule="atLeast"/>
+        <w:rPr>
+          <w:rFonts w:eastAsia="標楷體"/>
+          <w:sz w:val="28"/>
+          <w:szCs w:val="28"/>
+        </w:rPr>
+      </w:pPr>
+    </w:p>
+    <w:tbl>
+      <w:tblPr>
+        <w:tblW w:w="0" w:type="auto"/>
+        <w:tblInd w:w="80" w:type="dxa"/>
+        <w:tblBorders>
+          <w:top w:val="single" w:sz="4" w:space="0" w:color="auto"/>
+          <w:left w:val="single" w:sz="4" w:space="0" w:color="auto"/>
+          <w:bottom w:val="single" w:sz="4" w:space="0" w:color="auto"/>
+          <w:right w:val="single" w:sz="4" w:space="0" w:color="auto"/>
+          <w:insideH w:val="single" w:sz="4" w:space="0" w:color="auto"/>
+          <w:insideV w:val="single" w:sz="4" w:space="0" w:color="auto"/>
+        </w:tblBorders>
+        <w:tblLook w:val="04A0" w:firstRow="1" w:lastRow="0" w:firstColumn="1" w:lastColumn="0" w:noHBand="0" w:noVBand="1"/>
+      </w:tblPr>
+      <w:tblGrid>
+        <w:gridCol w:w="1304"/>
+        <w:gridCol w:w="992"/>
+        <w:gridCol w:w="7252"/>
+      </w:tblGrid>
+      <w:tr>
+        <w:tc>
+          <w:tcPr>
+            <w:tcW w:w="9548" w:type="dxa"/>
+            <w:gridSpan w:val="3"/>
+          </w:tcPr>
+          <w:p>
+            <w:pPr>
+              <w:snapToGrid w:val="0"/>
+              <w:spacing w:line="240" w:lineRule="atLeast"/>
+              <w:rPr>
+                <w:rFonts w:eastAsia="標楷體"/>
+                <w:sz w:val="28"/>
+                <w:szCs w:val="28"/>
+              </w:rPr>
+            </w:pPr>
+            <w:r>
+              <w:rPr>
+                <w:rFonts w:eastAsia="標楷體" w:hint="eastAsia"/>
+                <w:sz w:val="28"/>
+                <w:szCs w:val="28"/>
+              </w:rPr>
+              <w:t>{{</w:t>
+            </w:r>
+            <w:r>
+              <w:rPr>
+                <w:rFonts w:eastAsia="標楷體"/>
+                <w:sz w:val="28"/>
+                <w:szCs w:val="28"/>
+              </w:rPr>
+              <w:t>board</w:t>
+            </w:r>
+            <w:r>
+              <w:rPr>
+                <w:rFonts w:eastAsia="標楷體" w:hint="eastAsia"/>
+                <w:sz w:val="28"/>
+                <w:szCs w:val="28"/>
+              </w:rPr>
+              <w:t>_</w:t>
+            </w:r>
+            <w:r>
+              <w:rPr>
+                <w:rFonts w:eastAsia="標楷體"/>
+                <w:sz w:val="28"/>
+                <w:szCs w:val="28"/>
+              </w:rPr>
+              <w:t>minutes</w:t>
+            </w:r>
+            <w:r>
+              <w:rPr>
+                <w:rFonts w:eastAsia="標楷體" w:hint="eastAsia"/>
+                <w:sz w:val="28"/>
+                <w:szCs w:val="28"/>
+              </w:rPr>
+              <w:t>_table}}</w:t>
+            </w:r>
+          </w:p>
+        </w:tc>
+      </w:tr>
+      <w:tr>
+        <w:tc>
+          <w:tcPr>
+            <w:tcW w:w="1304" w:type="dxa"/>
+          </w:tcPr>
+          <w:p>
+            <w:pPr>
+              <w:snapToGrid w:val="0"/>
+              <w:spacing w:line="240" w:lineRule="atLeast"/>
+              <w:rPr>
+                <w:rFonts w:eastAsia="標楷體"/>
+                <w:sz w:val="28"/>
+                <w:szCs w:val="28"/>
+              </w:rPr>
+            </w:pPr>
+            <w:r>
+              <w:rPr>
+                <w:rFonts w:eastAsia="標楷體"/>
+                <w:color w:val="000000"/>
+              </w:rPr>
+              <w:t>{{</w:t>
+            </w:r>
+            <w:r>
+              <w:rPr>
+                <w:rFonts w:eastAsia="標楷體" w:hint="eastAsia"/>
+                <w:color w:val="000000"/>
+              </w:rPr>
+              <w:t>item</w:t>
+            </w:r>
+            <w:r>
+              <w:rPr>
+                <w:rFonts w:eastAsia="標楷體"/>
+                <w:color w:val="000000"/>
+              </w:rPr>
+              <w:t>}}</w:t>
+            </w:r>
+          </w:p>
+        </w:tc>
+        <w:tc>
+          <w:tcPr>
+            <w:tcW w:w="992" w:type="dxa"/>
+          </w:tcPr>
+          <w:p>
+            <w:pPr>
+              <w:snapToGrid w:val="0"/>
+              <w:spacing w:line="240" w:lineRule="atLeast"/>
+              <w:rPr>
+                <w:rFonts w:eastAsia="標楷體"/>
+                <w:sz w:val="28"/>
+                <w:szCs w:val="28"/>
+              </w:rPr>
+            </w:pPr>
+            <w:r>
+              <w:rPr>
+                <w:rFonts w:eastAsia="標楷體" w:hint="eastAsia"/>
+                <w:sz w:val="28"/>
+                <w:szCs w:val="28"/>
+              </w:rPr>
+              <w:t>案由：</w:t>
+            </w:r>
+          </w:p>
+        </w:tc>
+        <w:tc>
+          <w:tcPr>
+            <w:tcW w:w="7252" w:type="dxa"/>
+          </w:tcPr>
+          <w:p>
+            <w:pPr>
+              <w:snapToGrid w:val="0"/>
+              <w:spacing w:line="240" w:lineRule="atLeast"/>
+              <w:rPr>
+                <w:rFonts w:eastAsia="標楷體"/>
+                <w:sz w:val="28"/>
+                <w:szCs w:val="28"/>
+              </w:rPr>
+            </w:pPr>
+            <w:r>
+              <w:rPr>
+                <w:rFonts w:eastAsia="標楷體" w:hAnsi="標楷體"/>
+                <w:color w:val="000000"/>
+                <w:sz w:val="28"/>
+                <w:szCs w:val="28"/>
+              </w:rPr>
+              <w:t>{{AGENDA_TITLE}}</w:t>
+            </w:r>
+          </w:p>
+        </w:tc>
+      </w:tr>
+      <w:tr>
+        <w:tc>
+          <w:tcPr>
+            <w:tcW w:w="1304" w:type="dxa"/>
+          </w:tcPr>
+          <w:p>
+            <w:pPr>
+              <w:snapToGrid w:val="0"/>
+              <w:spacing w:line="240" w:lineRule="atLeast"/>
+              <w:rPr>
+                <w:rFonts w:eastAsia="標楷體"/>
+                <w:sz w:val="28"/>
+                <w:szCs w:val="28"/>
+              </w:rPr>
+            </w:pPr>
+          </w:p>
+        </w:tc>
+        <w:tc>
+          <w:tcPr>
+            <w:tcW w:w="992" w:type="dxa"/>
+          </w:tcPr>
+          <w:p>
+            <w:pPr>
+              <w:snapToGrid w:val="0"/>
+              <w:spacing w:line="240" w:lineRule="atLeast"/>
+              <w:rPr>
+                <w:rFonts w:eastAsia="標楷體"/>
+                <w:sz w:val="28"/>
+                <w:szCs w:val="28"/>
+              </w:rPr>
+            </w:pPr>
+            <w:r>
+              <w:rPr>
+                <w:rFonts w:eastAsia="標楷體" w:hint="eastAsia"/>
+                <w:sz w:val="28"/>
+                <w:szCs w:val="28"/>
+              </w:rPr>
+              <w:t>說明：</w:t>
+            </w:r>
+          </w:p>
+        </w:tc>
+        <w:tc>
+          <w:tcPr>
+            <w:tcW w:w="7252" w:type="dxa"/>
+          </w:tcPr>
+          <w:p>
+            <w:pPr>
+              <w:snapToGrid w:val="0"/>
+              <w:spacing w:line="240" w:lineRule="atLeast"/>
+              <w:rPr>
+                <w:rFonts w:eastAsia="標楷體"/>
+                <w:sz w:val="28"/>
+                <w:szCs w:val="28"/>
+              </w:rPr>
+            </w:pPr>
+            <w:r>
+              <w:rPr>
+                <w:rFonts w:eastAsia="標楷體" w:hAnsi="標楷體"/>
+                <w:color w:val="000000"/>
+                <w:sz w:val="28"/>
+                <w:szCs w:val="28"/>
+              </w:rPr>
+              <w:t>{{AGENDA_DESC}}</w:t>
+            </w:r>
+          </w:p>
+        </w:tc>
+      </w:tr>
+      <w:tr>
+        <w:tc>
+          <w:tcPr>
+            <w:tcW w:w="1304" w:type="dxa"/>
+          </w:tcPr>
+          <w:p>
+            <w:pPr>
+              <w:snapToGrid w:val="0"/>
+              <w:spacing w:line="240" w:lineRule="atLeast"/>
+              <w:rPr>
+                <w:rFonts w:eastAsia="標楷體"/>
+                <w:sz w:val="28"/>
+                <w:szCs w:val="28"/>
+              </w:rPr>
+            </w:pPr>
+          </w:p>
+        </w:tc>
+        <w:tc>
+          <w:tcPr>
+            <w:tcW w:w="992" w:type="dxa"/>
+          </w:tcPr>
+          <w:p>
+            <w:pPr>
+              <w:snapToGrid w:val="0"/>
+              <w:spacing w:line="240" w:lineRule="atLeast"/>
+              <w:rPr>
+                <w:rFonts w:eastAsia="標楷體"/>
+                <w:sz w:val="28"/>
+                <w:szCs w:val="28"/>
+              </w:rPr>
+            </w:pPr>
+            <w:r>
+              <w:rPr>
+                <w:rFonts w:eastAsia="標楷體" w:hint="eastAsia"/>
+                <w:sz w:val="28"/>
+                <w:szCs w:val="28"/>
+              </w:rPr>
+              <w:t>決議：</w:t>
+            </w:r>
+          </w:p>
+        </w:tc>
+        <w:tc>
+          <w:tcPr>
+            <w:tcW w:w="7252" w:type="dxa"/>
+          </w:tcPr>
+          <w:p>
+            <w:pPr>
+              <w:snapToGrid w:val="0"/>
+              <w:spacing w:line="240" w:lineRule="atLeast"/>
+              <w:rPr>
+                <w:rFonts w:eastAsia="標楷體"/>
+                <w:sz w:val="28"/>
+                <w:szCs w:val="28"/>
+              </w:rPr>
+            </w:pPr>
+            <w:r>
+              <w:rPr>
+                <w:rFonts w:eastAsia="標楷體" w:hAnsi="標楷體"/>
+                <w:color w:val="000000"/>
+                <w:sz w:val="28"/>
+                <w:szCs w:val="28"/>
+              </w:rPr>
+              <w:t>{{AGENDA_RESOLUTION}}</w:t>
+            </w:r>
+          </w:p>
+        </w:tc>
+      </w:tr>
+    </w:tbl>
+    <w:p>
+      <w:pPr>
+        <w:snapToGrid w:val="0"/>
+        <w:spacing w:line="240" w:lineRule="atLeast"/>
+        <w:rPr>
+          <w:rFonts w:eastAsia="標楷體"/>
+          <w:sz w:val="28"/>
+          <w:szCs w:val="28"/>
+        </w:rPr>
+      </w:pPr>
+    </w:p>
+    <w:p>
+      <w:pPr>
+        <w:snapToGrid w:val="0"/>
+        <w:spacing w:line="240" w:lineRule="atLeast"/>
+        <w:rPr>
+          <w:rFonts w:eastAsia="標楷體"/>
+          <w:sz w:val="28"/>
+          <w:szCs w:val="28"/>
+        </w:rPr>
+      </w:pPr>
+    </w:p>
+    <w:p>
+      <w:pPr>
+        <w:snapToGrid w:val="0"/>
+        <w:spacing w:line="240" w:lineRule="atLeast"/>
+        <w:rPr>
+          <w:rFonts w:eastAsia="標楷體"/>
+          <w:sz w:val="28"/>
+          <w:szCs w:val="28"/>
+        </w:rPr>
+      </w:pPr>
+    </w:p>
+    <w:p>
+      <w:pPr>
+        <w:snapToGrid w:val="0"/>
+        <w:spacing w:line="240" w:lineRule="atLeast"/>
+        <w:rPr>
+          <w:rFonts w:eastAsia="標楷體"/>
+          <w:sz w:val="28"/>
+          <w:szCs w:val="28"/>
+        </w:rPr>
+      </w:pPr>
     </w:p>
     <w:p>
       <w:pPr>
@@ -1869,7 +2288,17 @@
                 <w:szCs w:val="48"/>
               </w:rPr>
             </w:pPr>
-            <w:proofErr w:type="spellStart"/>
+            <w:r>
+              <w:rPr>
+                <w:rFonts w:ascii="標楷體" w:eastAsia="標楷體" w:hAnsi="標楷體" w:hint="eastAsia"/>
+                <w:b/>
+                <w:bCs/>
+                <w:color w:val="000000"/>
+                <w:sz w:val="36"/>
+                <w:szCs w:val="48"/>
+              </w:rPr>
+              <w:t>{{</w:t>
+            </w:r>
             <w:r>
               <w:rPr>
                 <w:rFonts w:ascii="標楷體" w:eastAsia="標楷體" w:hAnsi="標楷體"/>
@@ -1881,7 +2310,17 @@
               </w:rPr>
               <w:t>companyName</w:t>
             </w:r>
-            <w:proofErr w:type="spellEnd"/>
+            <w:r>
+              <w:rPr>
+                <w:rFonts w:ascii="標楷體" w:eastAsia="標楷體" w:hAnsi="標楷體" w:hint="eastAsia"/>
+                <w:b/>
+                <w:bCs/>
+                <w:color w:val="000000"/>
+                <w:sz w:val="36"/>
+                <w:szCs w:val="48"/>
+              </w:rPr>
+              <w:t>}}</w:t>
+            </w:r>
             <w:r>
               <w:rPr>
                 <w:rFonts w:ascii="標楷體" w:eastAsia="標楷體" w:hAnsi="標楷體" w:hint="eastAsia"/>
@@ -3810,7 +4249,17 @@
           <w:szCs w:val="48"/>
         </w:rPr>
       </w:pPr>
-      <w:proofErr w:type="spellStart"/>
+      <w:r>
+        <w:rPr>
+          <w:rFonts w:eastAsia="標楷體" w:hAnsi="標楷體" w:hint="eastAsia"/>
+          <w:b/>
+          <w:bCs/>
+          <w:color w:val="000000"/>
+          <w:sz w:val="36"/>
+          <w:szCs w:val="48"/>
+        </w:rPr>
+        <w:t>{{</w:t>
+      </w:r>
       <w:r>
         <w:rPr>
           <w:rFonts w:eastAsia="標楷體" w:hAnsi="標楷體"/>
@@ -3822,19 +4271,6 @@
         </w:rPr>
         <w:t>companyName</w:t>
       </w:r>
-      <w:proofErr w:type="spellEnd"/>
-    </w:p>
-    <w:p>
-      <w:pPr>
-        <w:snapToGrid w:val="0"/>
-        <w:spacing w:line="240" w:lineRule="atLeast"/>
-        <w:jc w:val="center"/>
-        <w:rPr>
-          <w:rFonts w:eastAsia="標楷體"/>
-          <w:sz w:val="28"/>
-          <w:szCs w:val="28"/>
-        </w:rPr>
-      </w:pPr>
       <w:r>
         <w:rPr>
           <w:rFonts w:eastAsia="標楷體" w:hAnsi="標楷體" w:hint="eastAsia"/>
@@ -3844,6 +4280,29 @@
           <w:sz w:val="36"/>
           <w:szCs w:val="48"/>
         </w:rPr>
+        <w:t>}}</w:t>
+      </w:r>
+    </w:p>
+    <w:p>
+      <w:pPr>
+        <w:snapToGrid w:val="0"/>
+        <w:spacing w:line="240" w:lineRule="atLeast"/>
+        <w:jc w:val="center"/>
+        <w:rPr>
+          <w:rFonts w:eastAsia="標楷體"/>
+          <w:sz w:val="28"/>
+          <w:szCs w:val="28"/>
+        </w:rPr>
+      </w:pPr>
+      <w:r>
+        <w:rPr>
+          <w:rFonts w:eastAsia="標楷體" w:hAnsi="標楷體" w:hint="eastAsia"/>
+          <w:b/>
+          <w:bCs/>
+          <w:color w:val="000000"/>
+          <w:sz w:val="36"/>
+          <w:szCs w:val="48"/>
+        </w:rPr>
         <w:t>委託書</w:t>
       </w:r>
     </w:p>
@@ -4026,7 +4485,14 @@
         </w:rPr>
         <w:t>委託人：</w:t>
       </w:r>
-      <w:proofErr w:type="spellStart"/>
+      <w:r>
+        <w:rPr>
+          <w:rFonts w:eastAsia="標楷體" w:hint="eastAsia"/>
+          <w:sz w:val="28"/>
+          <w:szCs w:val="28"/>
+        </w:rPr>
+        <w:t>{{</w:t>
+      </w:r>
       <w:r>
         <w:rPr>
           <w:rFonts w:eastAsia="標楷體"/>
@@ -4035,7 +4501,14 @@
         </w:rPr>
         <w:t>companyName</w:t>
       </w:r>
-      <w:proofErr w:type="spellEnd"/>
+      <w:r>
+        <w:rPr>
+          <w:rFonts w:eastAsia="標楷體" w:hint="eastAsia"/>
+          <w:sz w:val="28"/>
+          <w:szCs w:val="28"/>
+        </w:rPr>
+        <w:t>}}</w:t>
+      </w:r>
       <w:r>
         <w:rPr>
           <w:rFonts w:eastAsia="標楷體" w:hint="eastAsia"/>
@@ -4071,7 +4544,14 @@
         </w:rPr>
         <w:t>：</w:t>
       </w:r>
-      <w:proofErr w:type="spellStart"/>
+      <w:r>
+        <w:rPr>
+          <w:rFonts w:eastAsia="標楷體" w:hint="eastAsia"/>
+          <w:sz w:val="28"/>
+          <w:szCs w:val="28"/>
+        </w:rPr>
+        <w:t>{{</w:t>
+      </w:r>
       <w:r>
         <w:rPr>
           <w:rFonts w:eastAsia="標楷體"/>
@@ -4080,7 +4560,14 @@
         </w:rPr>
         <w:t>registrationNumber</w:t>
       </w:r>
-      <w:proofErr w:type="spellEnd"/>
+      <w:r>
+        <w:rPr>
+          <w:rFonts w:eastAsia="標楷體" w:hint="eastAsia"/>
+          <w:sz w:val="28"/>
+          <w:szCs w:val="28"/>
+        </w:rPr>
+        <w:t>}}</w:t>
+      </w:r>
     </w:p>
     <w:p>
       <w:pPr>
@@ -4102,11 +4589,27 @@
       </w:r>
       <w:r>
         <w:rPr>
+          <w:rFonts w:eastAsia="標楷體" w:hint="eastAsia"/>
+          <w:sz w:val="28"/>
+          <w:szCs w:val="28"/>
+        </w:rPr>
+        <w:t>{{</w:t>
+      </w:r>
+      <w:r>
+        <w:rPr>
           <w:rFonts w:eastAsia="標楷體"/>
           <w:sz w:val="28"/>
           <w:szCs w:val="28"/>
         </w:rPr>
         <w:t>chairperson</w:t>
+      </w:r>
+      <w:r>
+        <w:rPr>
+          <w:rFonts w:eastAsia="標楷體" w:hint="eastAsia"/>
+          <w:sz w:val="28"/>
+          <w:szCs w:val="28"/>
+        </w:rPr>
+        <w:t>}}</w:t>
       </w:r>
       <w:r>
         <w:rPr>
@@ -5523,6 +6026,7 @@
   <w:style w:type="character" w:default="1" w:styleId="a1">
     <w:name w:val="Default Paragraph Font"/>
     <w:uiPriority w:val="1"/>
+    <w:semiHidden/>
     <w:unhideWhenUsed/>
   </w:style>
   <w:style w:type="table" w:default="1" w:styleId="a2">
@@ -5725,6 +6229,22 @@
       <w:sz w:val="52"/>
       <w:szCs w:val="52"/>
     </w:rPr>
+  </w:style>
+  <w:style w:type="table" w:styleId="ad">
+    <w:name w:val="Table Grid"/>
+    <w:basedOn w:val="a2"/>
+    <w:uiPriority w:val="39"/>
+    <w:rsid w:val="00283D73"/>
+    <w:tblPr>
+      <w:tblBorders>
+        <w:top w:val="single" w:sz="4" w:space="0" w:color="auto"/>
+        <w:left w:val="single" w:sz="4" w:space="0" w:color="auto"/>
+        <w:bottom w:val="single" w:sz="4" w:space="0" w:color="auto"/>
+        <w:right w:val="single" w:sz="4" w:space="0" w:color="auto"/>
+        <w:insideH w:val="single" w:sz="4" w:space="0" w:color="auto"/>
+        <w:insideV w:val="single" w:sz="4" w:space="0" w:color="auto"/>
+      </w:tblBorders>
+    </w:tblPr>
   </w:style>
 </w:styles>
 </file>

</xml_diff>